<commit_message>
Consolida trabalho pendente da sessão: Negativa de Débito, painel de cancelamento, ícones e endpoints REST do portal
- Reescreve modeloNegativoDebito2017.docx e o texto gerado (Declaração de Pagamentos, sem linguagem de quitação)
- Adiciona painel "Pedidos de Cancelamento" na tela da secretaria com botão Descancelar
- Corrige ícones fa-* (renderizando quadrado em branco) de volta pra ui-icon-* em index.xhtml
- Adiciona PedidoCancelamento (model) e PortalRest (endpoints REST de boleto/comprovante) usados pelo portal do responsável
- Adiciona OfficeDOCUtil.editDoc2CaminhoAbsoluto (variante sem FacesContext, pra uso em REST)
- Adiciona navigation-case "cadastrar" no faces-config.xml
</commit_message>
<xml_diff>
--- a/src/main/webapp/modeloNegativoDebito2017.docx
+++ b/src/main/webapp/modeloNegativoDebito2017.docx
@@ -252,7 +252,7 @@
         <w:rPr>
           <w:b/>
         </w:rPr>
-        <w:t>DECLARAÇÃO DE QUITAÇÃO ANUAL DE DÉBITOS</w:t>
+        <w:t>DECLARAÇÃO DE PAGAMENTOS</w:t>
       </w:r>
     </w:p>
     <w:p>
@@ -275,71 +275,53 @@
         <w:spacing w:line="360" w:lineRule="auto"/>
         <w:jc w:val="both"/>
       </w:pPr>
-      <w:r>
-        <w:t xml:space="preserve">Centro Educacional Adonai CNPJ 14.395.954/0001-55, com endereço na Rua José Cosme Pamplona nº 2001 – Bela Vista - Palhoça, vem, através desta e, nos termos da Lei nº 12.007/2009, declarar que </w:t>
-      </w:r>
-      <w:r>
-        <w:t>adonainomeresponsavel</w:t>
-      </w:r>
-      <w:r>
-        <w:t xml:space="preserve">, </w:t>
-      </w:r>
-      <w:r>
-        <w:t xml:space="preserve">CPF: </w:t>
-      </w:r>
-      <w:r>
-        <w:t>adonaicpfresponsavel,</w:t>
-      </w:r>
-      <w:r>
-        <w:t>encontra-se adimplente em relação a todas as parcelas do Contrato de Prestação de Serviços de Educação Esc</w:t>
-      </w:r>
-      <w:r>
-        <w:t>olar</w:t>
-      </w:r>
-      <w:r>
-        <w:t xml:space="preserve"> para o ano letivo de adonaiano</w:t>
-      </w:r>
-      <w:r>
-        <w:t xml:space="preserve">, com anuidade no valor total </w:t>
-      </w:r>
-      <w:r>
-        <w:t xml:space="preserve">de R$ </w:t>
-      </w:r>
-      <w:r>
-        <w:t>adonaianuidade</w:t>
-      </w:r>
-      <w:r>
-        <w:t xml:space="preserve"> (divididos em </w:t>
-      </w:r>
-      <w:r>
-        <w:t>adonaiparcelas</w:t>
-      </w:r>
-      <w:r>
-        <w:t xml:space="preserve"> parcelas de R$ </w:t>
-      </w:r>
-      <w:r>
-        <w:t>adonaivalorparcelas</w:t>
-      </w:r>
-      <w:r>
-        <w:t>)</w:t>
-      </w:r>
-      <w:r>
-        <w:t>, cujo benefi</w:t>
-      </w:r>
-      <w:r>
-        <w:t xml:space="preserve">ciário </w:t>
-      </w:r>
-      <w:r>
-        <w:t xml:space="preserve">foi o aluno </w:t>
-      </w:r>
-      <w:r>
-        <w:t>adonainomealuno</w:t>
-      </w:r>
-      <w:r>
-        <w:t>.</w:t>
-      </w:r>
       <w:bookmarkStart w:id="0" w:name="_GoBack"/>
       <w:bookmarkEnd w:id="0"/>
+      <w:r>
+        <w:t xml:space="preserve">Centro Educacional Adonai CNPJ 14.395.954/0001-55, com endereço na Rua José Cosme Pamplona nº 2001 – Bela Vista - Palhoça, vem, através desta, declarar que </w:t>
+      </w:r>
+      <w:r>
+        <w:t>adonainomeresponsavel</w:t>
+      </w:r>
+      <w:r>
+        <w:t xml:space="preserve">, CPF: </w:t>
+      </w:r>
+      <w:r>
+        <w:t>adonaicpfresponsavel</w:t>
+      </w:r>
+      <w:r>
+        <w:t xml:space="preserve">, efetuou o pagamento de mensalidades referentes ao Contrato de Prestação de Serviços de Educação Escolar para o ano letivo de </w:t>
+      </w:r>
+      <w:r>
+        <w:t>adonaiano</w:t>
+      </w:r>
+      <w:r>
+        <w:t xml:space="preserve">, no valor total pago de R$ </w:t>
+      </w:r>
+      <w:r>
+        <w:t>adonaianuidade</w:t>
+      </w:r>
+      <w:r>
+        <w:t xml:space="preserve"> (referente a </w:t>
+      </w:r>
+      <w:r>
+        <w:t>adonaiparcelas</w:t>
+      </w:r>
+      <w:r>
+        <w:t xml:space="preserve"> parcela(s) de R$ </w:t>
+      </w:r>
+      <w:r>
+        <w:t>adonaivalorparcelas</w:t>
+      </w:r>
+      <w:r>
+        <w:t xml:space="preserve">), cujo beneficiário foi o aluno </w:t>
+      </w:r>
+      <w:r>
+        <w:t>adonainomealuno</w:t>
+      </w:r>
+      <w:r>
+        <w:t>.</w:t>
+      </w:r>
     </w:p>
     <w:p>
       <w:pPr>
@@ -347,10 +329,7 @@
         <w:jc w:val="both"/>
       </w:pPr>
       <w:r>
-        <w:t>Esta declaração substitui todos os recibos de pagamento da</w:t>
-      </w:r>
-      <w:r>
-        <w:t xml:space="preserve">s mensalidades do ano de </w:t>
+        <w:t xml:space="preserve">Esta declaração tem finalidade de comprovação de pagamento (Imposto de Renda) e substitui os recibos individuais de pagamento das mensalidades do ano de </w:t>
       </w:r>
       <w:r>
         <w:t>adonaiano</w:t>

</xml_diff>